<commit_message>
homework: add required figures to assignments
</commit_message>
<xml_diff>
--- a/course-content/authoring/shared/homework-problems/T3.docx
+++ b/course-content/authoring/shared/homework-problems/T3.docx
@@ -4,7 +4,7 @@
   <w:body>
     <w:p>
       <w:pPr>
-        <w:spacing w:before="0" w:after="240"/>
+        <w:spacing w:before="0" w:after="120"/>
         <w:jc w:val="center"/>
       </w:pPr>
       <w:r>
@@ -18,7 +18,7 @@
     </w:p>
     <w:p>
       <w:pPr>
-        <w:spacing w:after="120"/>
+        <w:spacing w:after="80"/>
       </w:pPr>
       <w:r>
         <w:rPr>
@@ -26,7 +26,7 @@
           <w:b w:val="0"/>
           <w:sz w:val="22"/>
         </w:rPr>
-        <w:t>本次作业包含 3 道闭题与 1 道开放题。</w:t>
+        <w:t>本次作业包含 `3` 道闭题与 `1` 道开放题。</w:t>
       </w:r>
     </w:p>
     <w:p>
@@ -44,7 +44,7 @@
     </w:p>
     <w:p>
       <w:pPr>
-        <w:spacing w:after="120"/>
+        <w:spacing w:after="80"/>
       </w:pPr>
       <w:r>
         <w:rPr>
@@ -57,7 +57,7 @@
     </w:p>
     <w:p>
       <w:pPr>
-        <w:spacing w:after="120"/>
+        <w:spacing w:after="80"/>
         <w:jc w:val="center"/>
       </w:pPr>
       <w:r>
@@ -71,7 +71,7 @@
     </w:p>
     <w:p>
       <w:pPr>
-        <w:spacing w:after="120"/>
+        <w:spacing w:after="80"/>
       </w:pPr>
       <w:r>
         <w:rPr>
@@ -79,43 +79,46 @@
           <w:b w:val="0"/>
           <w:sz w:val="22"/>
         </w:rPr>
-        <w:t>其中 K 为实参数。</w:t>
+        <w:t>其中 $K$ 为实参数。</w:t>
       </w:r>
     </w:p>
     <w:p>
       <w:pPr>
         <w:pStyle w:val="ListNumber"/>
-        <w:spacing w:after="60"/>
+        <w:spacing w:after="80"/>
       </w:pPr>
       <w:r>
         <w:rPr>
           <w:rFonts w:ascii="Microsoft YaHei" w:hAnsi="Microsoft YaHei" w:eastAsia="Microsoft YaHei"/>
+          <w:b w:val="0"/>
           <w:sz w:val="22"/>
         </w:rPr>
-        <w:t>用劳斯判据求系统稳定的 K 取值范围。</w:t>
+        <w:t>用劳斯判据求系统稳定的 $K$ 取值范围。</w:t>
       </w:r>
     </w:p>
     <w:p>
       <w:pPr>
         <w:pStyle w:val="ListNumber"/>
-        <w:spacing w:after="60"/>
+        <w:spacing w:after="80"/>
       </w:pPr>
       <w:r>
         <w:rPr>
           <w:rFonts w:ascii="Microsoft YaHei" w:hAnsi="Microsoft YaHei" w:eastAsia="Microsoft YaHei"/>
+          <w:b w:val="0"/>
           <w:sz w:val="22"/>
         </w:rPr>
-        <w:t>给出系统处于临界稳定时的 K 值。</w:t>
+        <w:t>给出系统处于临界稳定时的 $K$ 值。</w:t>
       </w:r>
     </w:p>
     <w:p>
       <w:pPr>
         <w:pStyle w:val="ListNumber"/>
-        <w:spacing w:after="60"/>
+        <w:spacing w:after="80"/>
       </w:pPr>
       <w:r>
         <w:rPr>
           <w:rFonts w:ascii="Microsoft YaHei" w:hAnsi="Microsoft YaHei" w:eastAsia="Microsoft YaHei"/>
+          <w:b w:val="0"/>
           <w:sz w:val="22"/>
         </w:rPr>
         <w:t>用一句话说明：为什么这里求出的稳定区间，只能看作后续参数筛选的第一层可行域？</w:t>
@@ -137,7 +140,7 @@
     </w:p>
     <w:p>
       <w:pPr>
-        <w:spacing w:after="120"/>
+        <w:spacing w:after="80"/>
       </w:pPr>
       <w:r>
         <w:rPr>
@@ -145,12 +148,12 @@
           <w:b w:val="0"/>
           <w:sz w:val="22"/>
         </w:rPr>
-        <w:t>某单位负反馈系统只采用比例控制，实际控制器增益记为 K_c，且只考虑 K_c ≥ 0。教师给出的完整根轨迹主图采用“作图增益” K_r，两者关系已明确标注为</w:t>
+        <w:t>某单位负反馈系统只采用比例控制，实际控制器增益记为 $K_c$，且只考虑 $K_c \ge 0$。教师给出的完整根轨迹主图采用“作图增益” $K_r$，两者关系已明确标注为</w:t>
       </w:r>
     </w:p>
     <w:p>
       <w:pPr>
-        <w:spacing w:after="120"/>
+        <w:spacing w:after="80"/>
         <w:jc w:val="center"/>
       </w:pPr>
       <w:r>
@@ -164,7 +167,73 @@
     </w:p>
     <w:p>
       <w:pPr>
+        <w:spacing w:after="80"/>
+      </w:pPr>
+      <w:r>
+        <w:rPr>
+          <w:rFonts w:ascii="Microsoft YaHei" w:hAnsi="Microsoft YaHei" w:eastAsia="Microsoft YaHei"/>
+          <w:b w:val="0"/>
+          <w:sz w:val="22"/>
+        </w:rPr>
+        <w:t>根轨迹读图示意如下。该图依据题干给出的关键节点绘制，用于完成读图、换算和趋势解释。</w:t>
+      </w:r>
+    </w:p>
+    <w:p>
+      <w:pPr>
+        <w:jc w:val="center"/>
+      </w:pPr>
+      <w:r>
+        <w:drawing>
+          <wp:inline xmlns:a="http://schemas.openxmlformats.org/drawingml/2006/main" xmlns:pic="http://schemas.openxmlformats.org/drawingml/2006/picture">
+            <wp:extent cx="5486400" cy="4489922"/>
+            <wp:docPr id="1" name="Picture 1"/>
+            <wp:cNvGraphicFramePr>
+              <a:graphicFrameLocks noChangeAspect="1"/>
+            </wp:cNvGraphicFramePr>
+            <a:graphic>
+              <a:graphicData uri="http://schemas.openxmlformats.org/drawingml/2006/picture">
+                <pic:pic>
+                  <pic:nvPicPr>
+                    <pic:cNvPr id="0" name="T3-2-root-locus-reading.png"/>
+                    <pic:cNvPicPr/>
+                  </pic:nvPicPr>
+                  <pic:blipFill>
+                    <a:blip r:embed="rId9"/>
+                    <a:stretch>
+                      <a:fillRect/>
+                    </a:stretch>
+                  </pic:blipFill>
+                  <pic:spPr>
+                    <a:xfrm>
+                      <a:off x="0" y="0"/>
+                      <a:ext cx="5486400" cy="4489922"/>
+                    </a:xfrm>
+                    <a:prstGeom prst="rect"/>
+                  </pic:spPr>
+                </pic:pic>
+              </a:graphicData>
+            </a:graphic>
+          </wp:inline>
+        </w:drawing>
+      </w:r>
+    </w:p>
+    <w:p>
+      <w:pPr>
         <w:spacing w:after="120"/>
+        <w:jc w:val="center"/>
+      </w:pPr>
+      <w:r>
+        <w:rPr>
+          <w:rFonts w:ascii="Microsoft YaHei" w:hAnsi="Microsoft YaHei" w:eastAsia="Microsoft YaHei"/>
+          <w:b w:val="0"/>
+          <w:sz w:val="18"/>
+        </w:rPr>
+        <w:t>根轨迹读图示意图</w:t>
+      </w:r>
+    </w:p>
+    <w:p>
+      <w:pPr>
+        <w:spacing w:after="80"/>
       </w:pPr>
       <w:r>
         <w:rPr>
@@ -178,63 +247,68 @@
     <w:p>
       <w:pPr>
         <w:pStyle w:val="ListNumber"/>
-        <w:spacing w:after="60"/>
+        <w:spacing w:after="80"/>
       </w:pPr>
       <w:r>
         <w:rPr>
           <w:rFonts w:ascii="Microsoft YaHei" w:hAnsi="Microsoft YaHei" w:eastAsia="Microsoft YaHei"/>
+          <w:b w:val="0"/>
           <w:sz w:val="22"/>
         </w:rPr>
-        <w:t>当 K_r=0 时，闭环极点位于 s=0,-2,-6。</w:t>
+        <w:t>当 $K_r=0$ 时，闭环极点位于 $s=0,-2,-6$。</w:t>
       </w:r>
     </w:p>
     <w:p>
       <w:pPr>
         <w:pStyle w:val="ListNumber"/>
-        <w:spacing w:after="60"/>
+        <w:spacing w:after="80"/>
       </w:pPr>
       <w:r>
         <w:rPr>
           <w:rFonts w:ascii="Microsoft YaHei" w:hAnsi="Microsoft YaHei" w:eastAsia="Microsoft YaHei"/>
+          <w:b w:val="0"/>
           <w:sz w:val="22"/>
         </w:rPr>
-        <w:t>从 s=0 与 s=-2 出发的两条实轴分支相向移动，并在 s≈ -0.8 处分离，此时 K_r≈ 1.6。</w:t>
+        <w:t>从 $s=0$ 与 $s=-2$ 出发的两条实轴分支相向移动，并在 $s\approx -0.8$ 处分离，此时 $K_r\approx 1.6$。</w:t>
       </w:r>
     </w:p>
     <w:p>
       <w:pPr>
         <w:pStyle w:val="ListNumber"/>
-        <w:spacing w:after="60"/>
+        <w:spacing w:after="80"/>
       </w:pPr>
       <w:r>
         <w:rPr>
           <w:rFonts w:ascii="Microsoft YaHei" w:hAnsi="Microsoft YaHei" w:eastAsia="Microsoft YaHei"/>
+          <w:b w:val="0"/>
           <w:sz w:val="22"/>
         </w:rPr>
-        <w:t>分离后形成一对共轭复极点，分别沿上、下两支轨迹移动；当 K_r=6 时，这对极点穿过虚轴，交点约为 s=± j2.4。</w:t>
+        <w:t>分离后形成一对共轭复极点，分别沿上、下两支轨迹移动；当 $K_r=6$ 时，这对极点穿过虚轴，交点约为 $s=\pm j2.4$。</w:t>
       </w:r>
     </w:p>
     <w:p>
       <w:pPr>
         <w:pStyle w:val="ListNumber"/>
-        <w:spacing w:after="60"/>
+        <w:spacing w:after="80"/>
       </w:pPr>
       <w:r>
         <w:rPr>
           <w:rFonts w:ascii="Microsoft YaHei" w:hAnsi="Microsoft YaHei" w:eastAsia="Microsoft YaHei"/>
+          <w:b w:val="0"/>
           <w:sz w:val="22"/>
         </w:rPr>
-        <w:t>当 K_r&gt;6 时，这对共轭极点进入右半平面。</w:t>
+        <w:t>当 $K_r&gt;6$ 时，这对共轭极点进入右半平面。</w:t>
       </w:r>
     </w:p>
     <w:p>
       <w:pPr>
         <w:pStyle w:val="ListNumber"/>
-        <w:spacing w:after="60"/>
+        <w:spacing w:after="80"/>
       </w:pPr>
       <w:r>
         <w:rPr>
           <w:rFonts w:ascii="Microsoft YaHei" w:hAnsi="Microsoft YaHei" w:eastAsia="Microsoft YaHei"/>
+          <w:b w:val="0"/>
           <w:sz w:val="22"/>
         </w:rPr>
         <w:t>从主图读得两组代表性点：</w:t>
@@ -243,32 +317,34 @@
     <w:p>
       <w:pPr>
         <w:pStyle w:val="ListBullet"/>
-        <w:spacing w:after="60"/>
+        <w:spacing w:after="80"/>
       </w:pPr>
       <w:r>
         <w:rPr>
           <w:rFonts w:ascii="Microsoft YaHei" w:hAnsi="Microsoft YaHei" w:eastAsia="Microsoft YaHei"/>
+          <w:b w:val="0"/>
           <w:sz w:val="22"/>
         </w:rPr>
-        <w:t>当 K_r=2 时，主导极点约为 s_{1,2}≈ -0.72 ± j0.78；</w:t>
+        <w:t>当 $K_r=2$ 时，主导极点约为 $s_{1,2}\approx -0.72 \pm j0.78$；</w:t>
       </w:r>
     </w:p>
     <w:p>
       <w:pPr>
         <w:pStyle w:val="ListBullet"/>
-        <w:spacing w:after="60"/>
+        <w:spacing w:after="80"/>
       </w:pPr>
       <w:r>
         <w:rPr>
           <w:rFonts w:ascii="Microsoft YaHei" w:hAnsi="Microsoft YaHei" w:eastAsia="Microsoft YaHei"/>
+          <w:b w:val="0"/>
           <w:sz w:val="22"/>
         </w:rPr>
-        <w:t>当 K_r=5 时，主导极点约为 s_{1,2}≈ -0.18 ± j1.92。</w:t>
+        <w:t>当 $K_r=5$ 时，主导极点约为 $s_{1,2}\approx -0.18 \pm j1.92$。</w:t>
       </w:r>
     </w:p>
     <w:p>
       <w:pPr>
-        <w:spacing w:after="120"/>
+        <w:spacing w:after="80"/>
       </w:pPr>
       <w:r>
         <w:rPr>
@@ -282,45 +358,48 @@
     <w:p>
       <w:pPr>
         <w:pStyle w:val="ListNumber"/>
-        <w:spacing w:after="60"/>
+        <w:spacing w:after="80"/>
       </w:pPr>
       <w:r>
         <w:rPr>
           <w:rFonts w:ascii="Microsoft YaHei" w:hAnsi="Microsoft YaHei" w:eastAsia="Microsoft YaHei"/>
+          <w:b w:val="0"/>
           <w:sz w:val="22"/>
         </w:rPr>
-        <w:t>写出闭环稳定的 K_r 取值窗口，并换算为实际控制器增益 K_c 的稳定窗口。</w:t>
+        <w:t>写出闭环稳定的 $K_r$ 取值窗口，并换算为实际控制器增益 $K_c$ 的稳定窗口。</w:t>
       </w:r>
     </w:p>
     <w:p>
       <w:pPr>
         <w:pStyle w:val="ListNumber"/>
-        <w:spacing w:after="60"/>
+        <w:spacing w:after="80"/>
       </w:pPr>
       <w:r>
         <w:rPr>
           <w:rFonts w:ascii="Microsoft YaHei" w:hAnsi="Microsoft YaHei" w:eastAsia="Microsoft YaHei"/>
+          <w:b w:val="0"/>
           <w:sz w:val="22"/>
         </w:rPr>
-        <w:t>若工程上要求“工作增益不超过稳定边界的 80%”，求允许的 K_c 上限。</w:t>
+        <w:t>若工程上要求“工作增益不超过稳定边界的 80%”，求允许的 $K_c$ 上限。</w:t>
       </w:r>
     </w:p>
     <w:p>
       <w:pPr>
         <w:pStyle w:val="ListNumber"/>
-        <w:spacing w:after="60"/>
+        <w:spacing w:after="80"/>
       </w:pPr>
       <w:r>
         <w:rPr>
           <w:rFonts w:ascii="Microsoft YaHei" w:hAnsi="Microsoft YaHei" w:eastAsia="Microsoft YaHei"/>
+          <w:b w:val="0"/>
           <w:sz w:val="22"/>
         </w:rPr>
-        <w:t>现把控制器增益从 K_c=0.50 增大到 K_c=1.25。说明根轨迹上的极点总体向哪个方向迁移，并结合题中给出的读点，解释闭环响应在振荡程度、超调趋势和衰减快慢上的变化。</w:t>
+        <w:t>现把控制器增益从 $K_c=0.50$ 增大到 $K_c=1.25$。说明根轨迹上的极点总体向哪个方向迁移，并结合题中给出的读点，解释闭环响应在振荡程度、超调趋势和衰减快慢上的变化。</w:t>
       </w:r>
     </w:p>
     <w:p>
       <w:pPr>
-        <w:spacing w:after="120"/>
+        <w:spacing w:after="80"/>
       </w:pPr>
       <w:r>
         <w:rPr>
@@ -347,7 +426,7 @@
     </w:p>
     <w:p>
       <w:pPr>
-        <w:spacing w:after="120"/>
+        <w:spacing w:after="80"/>
       </w:pPr>
       <w:r>
         <w:rPr>
@@ -360,7 +439,7 @@
     </w:p>
     <w:p>
       <w:pPr>
-        <w:spacing w:after="120"/>
+        <w:spacing w:after="80"/>
       </w:pPr>
       <w:r>
         <w:rPr>
@@ -368,12 +447,12 @@
           <w:b w:val="0"/>
           <w:sz w:val="22"/>
         </w:rPr>
-        <w:t>某单位负反馈系统仅通过比例增益 K 调整闭环性能。已知根轨迹在 K=2.8 时与虚轴相交，继续增大 K 将失稳；随着 K 从 1.0 增大到 2.6，主导极点逐步向虚轴靠近，振荡趋势增强。若无特殊说明，下表中的调节时间与超调量按同一口径统计。</w:t>
+        <w:t>某单位负反馈系统仅通过比例增益 $K$ 调整闭环性能。已知根轨迹在 $K=2.8$ 时与虚轴相交，继续增大 $K$ 将失稳；随着 $K$ 从 $1.0$ 增大到 $2.6$，主导极点逐步向虚轴靠近，振荡趋势增强。若无特殊说明，下表中的调节时间与超调量按同一口径统计。</w:t>
       </w:r>
     </w:p>
     <w:p>
       <w:pPr>
-        <w:spacing w:after="120"/>
+        <w:spacing w:after="80"/>
       </w:pPr>
       <w:r>
         <w:rPr>
@@ -387,45 +466,48 @@
     <w:p>
       <w:pPr>
         <w:pStyle w:val="ListNumber"/>
-        <w:spacing w:after="60"/>
+        <w:spacing w:after="80"/>
       </w:pPr>
       <w:r>
         <w:rPr>
           <w:rFonts w:ascii="Microsoft YaHei" w:hAnsi="Microsoft YaHei" w:eastAsia="Microsoft YaHei"/>
+          <w:b w:val="0"/>
           <w:sz w:val="22"/>
         </w:rPr>
-        <w:t>K=1.0，主导极点为 -1.6 ± j0.7，调节时间 2.8\ s，超调量 6%，现象：稳定且振荡较轻，但响应偏慢。</w:t>
+        <w:t>$K=1.0$，主导极点为 $-1.6 \pm j0.7$，调节时间 $2.8\ \mathrm{s}$，超调量 `6%`，现象：稳定且振荡较轻，但响应偏慢。</w:t>
       </w:r>
     </w:p>
     <w:p>
       <w:pPr>
         <w:pStyle w:val="ListNumber"/>
-        <w:spacing w:after="60"/>
+        <w:spacing w:after="80"/>
       </w:pPr>
       <w:r>
         <w:rPr>
           <w:rFonts w:ascii="Microsoft YaHei" w:hAnsi="Microsoft YaHei" w:eastAsia="Microsoft YaHei"/>
+          <w:b w:val="0"/>
           <w:sz w:val="22"/>
         </w:rPr>
-        <w:t>K=2.0，主导极点为 -0.9 ± j1.5，调节时间 1.9\ s，超调量 16%，现象：响应更快，但振荡明显、超调偏大。</w:t>
+        <w:t>$K=2.0$，主导极点为 $-0.9 \pm j1.5$，调节时间 $1.9\ \mathrm{s}$，超调量 `16%`，现象：响应更快，但振荡明显、超调偏大。</w:t>
       </w:r>
     </w:p>
     <w:p>
       <w:pPr>
         <w:pStyle w:val="ListNumber"/>
-        <w:spacing w:after="60"/>
+        <w:spacing w:after="80"/>
       </w:pPr>
       <w:r>
         <w:rPr>
           <w:rFonts w:ascii="Microsoft YaHei" w:hAnsi="Microsoft YaHei" w:eastAsia="Microsoft YaHei"/>
+          <w:b w:val="0"/>
           <w:sz w:val="22"/>
         </w:rPr>
-        <w:t>K=2.6，主导极点为 -0.25 ± j1.9，调节时间 4.6\ s，超调量 32%，现象：已非常接近临界稳定，振荡重，动态变差。</w:t>
+        <w:t>$K=2.6$，主导极点为 $-0.25 \pm j1.9$，调节时间 $4.6\ \mathrm{s}$，超调量 `32%`，现象：已非常接近临界稳定，振荡重，动态变差。</w:t>
       </w:r>
     </w:p>
     <w:p>
       <w:pPr>
-        <w:spacing w:after="120"/>
+        <w:spacing w:after="80"/>
       </w:pPr>
       <w:r>
         <w:rPr>
@@ -439,11 +521,12 @@
     <w:p>
       <w:pPr>
         <w:pStyle w:val="ListBullet"/>
-        <w:spacing w:after="60"/>
+        <w:spacing w:after="80"/>
       </w:pPr>
       <w:r>
         <w:rPr>
           <w:rFonts w:ascii="Microsoft YaHei" w:hAnsi="Microsoft YaHei" w:eastAsia="Microsoft YaHei"/>
+          <w:b w:val="0"/>
           <w:sz w:val="22"/>
         </w:rPr>
         <w:t>考虑模型不确定性，工作点不能贴近临界稳定边界；</w:t>
@@ -452,32 +535,34 @@
     <w:p>
       <w:pPr>
         <w:pStyle w:val="ListBullet"/>
-        <w:spacing w:after="60"/>
+        <w:spacing w:after="80"/>
       </w:pPr>
       <w:r>
         <w:rPr>
           <w:rFonts w:ascii="Microsoft YaHei" w:hAnsi="Microsoft YaHei" w:eastAsia="Microsoft YaHei"/>
+          <w:b w:val="0"/>
           <w:sz w:val="22"/>
         </w:rPr>
-        <w:t>超调量希望不超过 10%；</w:t>
+        <w:t>超调量希望不超过 `10%`；</w:t>
       </w:r>
     </w:p>
     <w:p>
       <w:pPr>
         <w:pStyle w:val="ListBullet"/>
-        <w:spacing w:after="60"/>
+        <w:spacing w:after="80"/>
       </w:pPr>
       <w:r>
         <w:rPr>
           <w:rFonts w:ascii="Microsoft YaHei" w:hAnsi="Microsoft YaHei" w:eastAsia="Microsoft YaHei"/>
+          <w:b w:val="0"/>
           <w:sz w:val="22"/>
         </w:rPr>
-        <w:t>调节时间希望不超过 2.0 s。</w:t>
+        <w:t>调节时间希望不超过 `2.0 s`。</w:t>
       </w:r>
     </w:p>
     <w:p>
       <w:pPr>
-        <w:spacing w:after="120"/>
+        <w:spacing w:after="80"/>
       </w:pPr>
       <w:r>
         <w:rPr>
@@ -491,11 +576,12 @@
     <w:p>
       <w:pPr>
         <w:pStyle w:val="ListNumber"/>
-        <w:spacing w:after="60"/>
+        <w:spacing w:after="80"/>
       </w:pPr>
       <w:r>
         <w:rPr>
           <w:rFonts w:ascii="Microsoft YaHei" w:hAnsi="Microsoft YaHei" w:eastAsia="Microsoft YaHei"/>
+          <w:b w:val="0"/>
           <w:sz w:val="22"/>
         </w:rPr>
         <w:t>在上述冲突中，必须先守住哪一条约束？</w:t>
@@ -504,11 +590,12 @@
     <w:p>
       <w:pPr>
         <w:pStyle w:val="ListNumber"/>
-        <w:spacing w:after="60"/>
+        <w:spacing w:after="80"/>
       </w:pPr>
       <w:r>
         <w:rPr>
           <w:rFonts w:ascii="Microsoft YaHei" w:hAnsi="Microsoft YaHei" w:eastAsia="Microsoft YaHei"/>
+          <w:b w:val="0"/>
           <w:sz w:val="22"/>
         </w:rPr>
         <w:t>哪一条动态要求在本情境下只能部分满足？</w:t>
@@ -517,11 +604,12 @@
     <w:p>
       <w:pPr>
         <w:pStyle w:val="ListNumber"/>
-        <w:spacing w:after="60"/>
+        <w:spacing w:after="80"/>
       </w:pPr>
       <w:r>
         <w:rPr>
           <w:rFonts w:ascii="Microsoft YaHei" w:hAnsi="Microsoft YaHei" w:eastAsia="Microsoft YaHei"/>
+          <w:b w:val="0"/>
           <w:sz w:val="22"/>
         </w:rPr>
         <w:t>依据题中根轨迹摘要和候选数据，给出结构化理由。</w:t>
@@ -529,7 +617,7 @@
     </w:p>
     <w:p>
       <w:pPr>
-        <w:spacing w:after="120"/>
+        <w:spacing w:after="80"/>
       </w:pPr>
       <w:r>
         <w:rPr>
@@ -556,7 +644,7 @@
     </w:p>
     <w:p>
       <w:pPr>
-        <w:spacing w:after="120"/>
+        <w:spacing w:after="80"/>
       </w:pPr>
       <w:r>
         <w:rPr>
@@ -569,7 +657,7 @@
     </w:p>
     <w:p>
       <w:pPr>
-        <w:spacing w:after="120"/>
+        <w:spacing w:after="80"/>
       </w:pPr>
       <w:r>
         <w:rPr>
@@ -583,11 +671,12 @@
     <w:p>
       <w:pPr>
         <w:pStyle w:val="ListNumber"/>
-        <w:spacing w:after="60"/>
+        <w:spacing w:after="80"/>
       </w:pPr>
       <w:r>
         <w:rPr>
           <w:rFonts w:ascii="Microsoft YaHei" w:hAnsi="Microsoft YaHei" w:eastAsia="Microsoft YaHei"/>
+          <w:b w:val="0"/>
           <w:sz w:val="22"/>
         </w:rPr>
         <w:t>先在“稳定问题 / 动态问题 / 稳态问题”中判断当前最主要的问题属于哪一类，并用 O2 中已有模型、响应或仿真结果给出 1-2 条直接证据。</w:t>
@@ -596,11 +685,12 @@
     <w:p>
       <w:pPr>
         <w:pStyle w:val="ListNumber"/>
-        <w:spacing w:after="60"/>
+        <w:spacing w:after="80"/>
       </w:pPr>
       <w:r>
         <w:rPr>
           <w:rFonts w:ascii="Microsoft YaHei" w:hAnsi="Microsoft YaHei" w:eastAsia="Microsoft YaHei"/>
+          <w:b w:val="0"/>
           <w:sz w:val="22"/>
         </w:rPr>
         <w:t>明确说明它属于哪条机理线。不能只说“响应不好”，必须说清你为什么把它判为稳定机理线、动态机理线或稳态机理线。</w:t>
@@ -609,11 +699,12 @@
     <w:p>
       <w:pPr>
         <w:pStyle w:val="ListNumber"/>
-        <w:spacing w:after="60"/>
+        <w:spacing w:after="80"/>
       </w:pPr>
       <w:r>
         <w:rPr>
           <w:rFonts w:ascii="Microsoft YaHei" w:hAnsi="Microsoft YaHei" w:eastAsia="Microsoft YaHei"/>
+          <w:b w:val="0"/>
           <w:sz w:val="22"/>
         </w:rPr>
         <w:t>只使用本阶段允许的语言，对主要问题给出结构机理解释。允许使用：稳定边界、极点位置、主导极点、增益变化与极点迁移、根轨迹趋势、时域响应现象。若你选择“稳态问题”，只能用 O2 中可直接观察的终值偏差或低频现象作证据，不得调用型别、积分、静态误差系数等后续语言。</w:t>
@@ -622,37 +713,40 @@
     <w:p>
       <w:pPr>
         <w:pStyle w:val="ListNumber"/>
-        <w:spacing w:after="60"/>
+        <w:spacing w:after="80"/>
       </w:pPr>
       <w:r>
         <w:rPr>
           <w:rFonts w:ascii="Microsoft YaHei" w:hAnsi="Microsoft YaHei" w:eastAsia="Microsoft YaHei"/>
+          <w:b w:val="0"/>
           <w:sz w:val="22"/>
         </w:rPr>
-        <w:t>给出 1 张必要图表或对照表，并用 2-3 句说明该图表支持了哪条诊断。图表可采用“极点-响应对照”“增益-极点迁移对照”“模型参数-现象对照”等形式。</w:t>
+        <w:t>给出 `1` 张必要图表或对照表，并用 `2-3` 句说明该图表支持了哪条诊断。图表可采用“极点-响应对照”“增益-极点迁移对照”“模型参数-现象对照”等形式。</w:t>
       </w:r>
     </w:p>
     <w:p>
       <w:pPr>
         <w:pStyle w:val="ListNumber"/>
-        <w:spacing w:after="60"/>
+        <w:spacing w:after="80"/>
       </w:pPr>
       <w:r>
         <w:rPr>
           <w:rFonts w:ascii="Microsoft YaHei" w:hAnsi="Microsoft YaHei" w:eastAsia="Microsoft YaHei"/>
+          <w:b w:val="0"/>
           <w:sz w:val="22"/>
         </w:rPr>
-        <w:t>若诊断涉及动态或稳定判断，必须附 MATLAB/Octave 仿真代码、结果图与最小复现实验说明。</w:t>
+        <w:t>若诊断涉及动态或稳定判断，必须附 `MATLAB/Octave` 仿真代码、结果图与最小复现实验说明。</w:t>
       </w:r>
     </w:p>
     <w:p>
       <w:pPr>
         <w:pStyle w:val="ListNumber"/>
-        <w:spacing w:after="60"/>
+        <w:spacing w:after="80"/>
       </w:pPr>
       <w:r>
         <w:rPr>
           <w:rFonts w:ascii="Microsoft YaHei" w:hAnsi="Microsoft YaHei" w:eastAsia="Microsoft YaHei"/>
+          <w:b w:val="0"/>
           <w:sz w:val="22"/>
         </w:rPr>
         <w:t>最后用“主要矛盾清单”收束：写出当前主要矛盾、一个次要矛盾，以及为什么本次不进入控制结构最终定夺。</w:t>
@@ -661,19 +755,20 @@
     <w:p>
       <w:pPr>
         <w:pStyle w:val="ListNumber"/>
-        <w:spacing w:after="60"/>
+        <w:spacing w:after="80"/>
       </w:pPr>
       <w:r>
         <w:rPr>
           <w:rFonts w:ascii="Microsoft YaHei" w:hAnsi="Microsoft YaHei" w:eastAsia="Microsoft YaHei"/>
+          <w:b w:val="0"/>
           <w:sz w:val="22"/>
         </w:rPr>
-        <w:t>附 AI 使用记录摘要，写明你如何使用 AI、如何核查和修改 AI 输出。</w:t>
+        <w:t>附 `AI 使用记录摘要`，写明你如何使用 AI、如何核查和修改 AI 输出。</w:t>
       </w:r>
     </w:p>
     <w:p>
       <w:pPr>
-        <w:spacing w:after="120"/>
+        <w:spacing w:after="80"/>
       </w:pPr>
       <w:r>
         <w:rPr>
@@ -687,37 +782,40 @@
     <w:p>
       <w:pPr>
         <w:pStyle w:val="ListBullet"/>
-        <w:spacing w:after="60"/>
+        <w:spacing w:after="80"/>
       </w:pPr>
       <w:r>
         <w:rPr>
           <w:rFonts w:ascii="Microsoft YaHei" w:hAnsi="Microsoft YaHei" w:eastAsia="Microsoft YaHei"/>
+          <w:b w:val="0"/>
           <w:sz w:val="22"/>
         </w:rPr>
-        <w:t>主体正文不超过 700 字。</w:t>
+        <w:t>主体正文不超过 `700` 字。</w:t>
       </w:r>
     </w:p>
     <w:p>
       <w:pPr>
         <w:pStyle w:val="ListBullet"/>
-        <w:spacing w:after="60"/>
+        <w:spacing w:after="80"/>
       </w:pPr>
       <w:r>
         <w:rPr>
           <w:rFonts w:ascii="Microsoft YaHei" w:hAnsi="Microsoft YaHei" w:eastAsia="Microsoft YaHei"/>
+          <w:b w:val="0"/>
           <w:sz w:val="22"/>
         </w:rPr>
-        <w:t>允许附 1-3 张图、表或示意图。</w:t>
+        <w:t>允许附 `1-3` 张图、表或示意图。</w:t>
       </w:r>
     </w:p>
     <w:p>
       <w:pPr>
         <w:pStyle w:val="ListBullet"/>
-        <w:spacing w:after="60"/>
+        <w:spacing w:after="80"/>
       </w:pPr>
       <w:r>
         <w:rPr>
           <w:rFonts w:ascii="Microsoft YaHei" w:hAnsi="Microsoft YaHei" w:eastAsia="Microsoft YaHei"/>
+          <w:b w:val="0"/>
           <w:sz w:val="22"/>
         </w:rPr>
         <w:t>本题只做机理诊断，不做控制结构最终定夺，不允许写成完整设计报告。</w:t>
@@ -726,11 +824,12 @@
     <w:p>
       <w:pPr>
         <w:pStyle w:val="ListBullet"/>
-        <w:spacing w:after="60"/>
+        <w:spacing w:after="80"/>
       </w:pPr>
       <w:r>
         <w:rPr>
           <w:rFonts w:ascii="Microsoft YaHei" w:hAnsi="Microsoft YaHei" w:eastAsia="Microsoft YaHei"/>
+          <w:b w:val="0"/>
           <w:sz w:val="22"/>
         </w:rPr>
         <w:t>不得调用零点、型别、积分稳态改善、Nyquist 判据、Bode 判稳或完整控制器选型语言。</w:t>
@@ -738,7 +837,7 @@
     </w:p>
     <w:sectPr>
       <w:pgSz w:w="12240" w:h="15840"/>
-      <w:pgMar w:top="1080" w:right="1224" w:bottom="1080" w:left="1224" w:header="720" w:footer="720" w:gutter="0"/>
+      <w:pgMar w:top="1440" w:right="1800" w:bottom="1440" w:left="1800" w:header="720" w:footer="720" w:gutter="0"/>
       <w:cols w:space="720"/>
       <w:docGrid w:linePitch="360"/>
     </w:sectPr>
@@ -1109,10 +1208,6 @@
     <w:name w:val="Normal"/>
     <w:qFormat/>
     <w:rsid w:val="00FC693F"/>
-    <w:rPr>
-      <w:rFonts w:ascii="Microsoft YaHei" w:hAnsi="Microsoft YaHei" w:eastAsia="Microsoft YaHei"/>
-      <w:sz w:val="22"/>
-    </w:rPr>
   </w:style>
   <w:style w:type="paragraph" w:styleId="Header">
     <w:name w:val="header"/>

</xml_diff>